<commit_message>
Document PostgreSQL design and database delivery backlog
Define module-owned customer, guest, content and external-gift records with
scoped constraints, transaction boundaries and separate future ledgers.
Synchronize specs, ADRs, Word references and GitHub planning ownership; add
three database foundation stories and reproducible backlog validation.

Refs #62, #63, #64, #65
</commit_message>
<xml_diff>
--- a/docs/reference/DigitalCardBox Executive Summary.docx
+++ b/docs/reference/DigitalCardBox Executive Summary.docx
@@ -19,7 +19,7 @@
     <w:p>
       <w:pPr/>
       <w:r>
-        <w:t>11 October 2026  |  United States pilot  |  Planning case</w:t>
+        <w:t xml:space="preserve">13 October 2026  |  United States pilot  |  Planning case</w:t>
       </w:r>
     </w:p>
     <w:p>
@@ -38,7 +38,7 @@
     </w:p>
     <w:p>
       <w:r>
-        <w:t>DigitalCardBox is the working name. A private external-wallet MVP is targeted for 31 October 2026, with 114–157 focused developer hours over three weeks. This release includes manual and AI-assisted editable cards, a host event link and QR, safe multi-service external gift handoff, and a private CardVault. Generated backgrounds, two supervised events, paid checkout and integrated gifts follow separate gates; the broader pilot remains 126–192 hours. The $500 development fee is indefinitely fixed.</w:t>
+        <w:t xml:space="preserve">DigitalCardBox is the working name. A private external-wallet MVP is targeted for 31 October 2026, with 180 focused developer hours over three weeks. This release includes manual and AI-assisted editable cards, a host event link and QR, safe multi-service external gift handoff, and a private CardVault. Generated backgrounds, two supervised events, paid checkout and integrated gifts follow separate gates; the broader pilot remains 192–215 hours. The $500 development fee is indefinitely fixed.</w:t>
       </w:r>
     </w:p>
     <w:p>
@@ -543,7 +543,7 @@
     <w:p>
       <w:pPr/>
       <w:r>
-        <w:t>The founder has a one-time, indefinitely fixed $500 development arrangement with the developer for this app, including planned later code phases. The October private MVP targets 114–157 focused hours over three weeks, with human time concentrated on authorization, payment routing, mobile accessibility and failure tests. The broader 126–192-hour, 6–8-week pilot includes supervised events and optional image work after October. Hours affect scheduling, not the fee. The bootstrapped three-month cash subtotal remains $3,171–$7,831, excluding founder pay, paid support, contingency and outside security/accessibility review. Integrated gifts add 140–220 hours, premium checkout 12–20, and licensed music 16–28 after rights clearance, with separate external charges requiring quotes.</w:t>
+        <w:t xml:space="preserve">The founder has a one-time, indefinitely fixed $500 development arrangement with the developer for this app, including planned later code phases. The October private MVP targets 180 focused hours over three weeks, with human time concentrated on authorization, payment routing, mobile accessibility and failure tests. The broader 192–215-hour, 6–8-week pilot includes supervised events and optional image work after October. Hours affect scheduling, not the fee. The bootstrapped three-month cash subtotal remains $3,171–$7,831, excluding founder pay, paid support, contingency and outside security/accessibility review. Integrated gifts add 140–220 hours, premium checkout 12–20, and licensed music 16–28 after rights clearance, with separate external charges requiring quotes.</w:t>
       </w:r>
     </w:p>
     <w:p>
@@ -1103,6 +1103,39 @@
         </w:tc>
       </w:tr>
     </w:tbl>
+    <w:p>
+      <w:pPr>
+        <w:pStyle w:val="Heading1"/>
+      </w:pPr>
+      <w:r>
+        <w:t xml:space="preserve">Database design and delivery update — 13 October 2026</w:t>
+      </w:r>
+    </w:p>
+    <w:p>
+      <w:r>
+        <w:t xml:space="preserve">Canonical decisions: docs/specs/DATA_MODEL.md and ADR 0005. Use one managed PostgreSQL database per environment with private object storage for photos and exports. Evaluate Supabase first; actual provider, version, identity integration and connection adapter remain subject to the ADR 0001 deployment spike. No database/service is provisioned by this planning change.</w:t>
+      </w:r>
+    </w:p>
+    <w:p>
+      <w:r>
+        <w:t xml:space="preserve">Store one provider-linked customer identity, anonymous event-scoped guests separate from expiring sessions, unified note/card submissions, explicit consent and moderation history, immutable encrypted gift destination versions, external intent/activity and private book snapshots/exports. Module boundaries remain public contracts with scoped relational keys and short shared transactions. Outbox and deduplication protect accepted writes and host alerts.</w:t>
+      </w:r>
+    </w:p>
+    <w:p>
+      <w:r>
+        <w:t xml:space="preserve">External gift activity is unconfirmed unless the host marks a checked receipt; neither a handoff nor a guest report proves payment. Future premium purchase transactions belong to Billing orders/attempts/verified events/entitlements/refunds. Approved integrated gift processing has a separate Gifts ledger/payout/reconciliation design and requires a new provider-approved ADR.</w:t>
+      </w:r>
+    </w:p>
+    <w:p>
+      <w:r>
+        <w:t xml:space="preserve">The detailed backlog now has 180 October hours across 54 stories: previous 156 hours plus 24 explicit database-foundation hours in DCB-E18. Weekly totals are 72/54/54, so October 31 requires capacity replanning. The prior 114–157 October and 126–192 broader-pilot ranges are historical; the provisional broader pilot is 192–215 hours (180 + prior 12–35 follow-on allowance), pending overlap review. Do not add the old aggregate database allowance again. The fixed one-time $500 development arrangement and vendor-price assumptions are unchanged.</w:t>
+      </w:r>
+    </w:p>
+    <w:p>
+      <w:r>
+        <w:t xml:space="preserve">Existing feature stories own behavior; existing Security stories own encryption and tested database/media restore, published retention and a manual deletion runbook. Database design alone is not implementation or verified transaction history. Guest intake closure does not delete private CardVault records or promise indefinite hosting. Automated deletion and future checkout remain Post-MVP.</w:t>
+      </w:r>
+    </w:p>
     <w:sectPr>
       <w:footerReference w:type="default" r:id="rId9"/>
       <w:pgSz w:w="12240" w:h="15840"/>

</xml_diff>